<commit_message>
Añadir el Anexo I del cuaderno metodológico: arquitectura técnica
Convierte ARQUITECTURA.md a Word como primer anexo del cuaderno. La conversión
se hace desde el fichero Markdown, no reescribiendo el contenido, así que la
numeración de secciones y las referencias internas coinciden con el original.

Los dos diagramas Mermaid se rasterizan con Chromium y la paleta ODESOCAN, y se
incrustan como imágenes: el grafo de dependencias entre capas y el flujo de
datos completo de la web pública al dashboard.

El cuaderno se regenera para que sus dos referencias a ARQUITECTURA.md apunten
ahora al Anexo I.

Co-Authored-By: Claude Opus 5 <noreply@anthropic.com>
Claude-Session: https://claude.ai/code/session_01Fq5acjCGYMtqqtRR3C9iyn
</commit_message>
<xml_diff>
--- a/Cuaderno-metodologico-Observatorio-de-Medios.docx
+++ b/Cuaderno-metodologico-Observatorio-de-Medios.docx
@@ -428,7 +428,7 @@
           <w:sz w:val="21"/>
           <w:szCs w:val="21"/>
         </w:rPr>
-        <w:t xml:space="preserve">Este documento no describe la infraestructura técnica del observatorio —eso lo hace ARQUITECTURA.md, en el mismo repositorio— sino su condición de instrumento de medida en ciencias de la comunicación. Responde a una pregunta previa a cualquier análisis: ¿qué inferencias soporta este corpus, y cuáles no?</w:t>
+        <w:t xml:space="preserve">Este documento no describe la infraestructura técnica del observatorio —eso lo hace el Anexo I, que reproduce el índice técnico ARQUITECTURA.md del repositorio— sino su condición de instrumento de medida en ciencias de la comunicación. Responde a una pregunta previa a cualquier análisis: ¿qué inferencias soporta este corpus, y cuáles no?</w:t>
       </w:r>
     </w:p>
     <w:p>
@@ -9211,7 +9211,7 @@
           <w:sz w:val="19"/>
           <w:szCs w:val="19"/>
         </w:rPr>
-        <w:t xml:space="preserve">ODESOCAN (2026). medios-odesocan: ARQUITECTURA.md. Índice técnico de la infraestructura del observatorio.</w:t>
+        <w:t xml:space="preserve">ODESOCAN (2026). Anexo I · Arquitectura técnica del observatorio. Reproducción del índice técnico ARQUITECTURA.md del repositorio medios-odesocan.</w:t>
       </w:r>
     </w:p>
     <w:p>

</xml_diff>